<commit_message>
Update Capstone 23.1 Week 12: actual posted reflection confirmed
Minor formatting updates; content matches actual Mar 15 discussion post.
5 PCA-parallel prompts: strategy evolution, dominant PCs per function,
explore-vs-reduce decision rule, final round plan, variance-as-diagnostic.

Co-Authored-By: Claude Sonnet 4.6 <noreply@anthropic.com>
</commit_message>
<xml_diff>
--- a/Black-Box-Optimisation-Challenge/capstone_component_23_1_week_12.docx
+++ b/Black-Box-Optimisation-Challenge/capstone_component_23_1_week_12.docx
@@ -46,6 +46,22 @@
           <w:b/>
         </w:rPr>
         <w:t xml:space="preserve">Submitted:</w:t>
+      </w:r>
+      <w:r>
+        <w:t xml:space="preserve"> </w:t>
+      </w:r>
+      <w:r>
+        <w:t xml:space="preserve">15/03/2026</w:t>
+      </w:r>
+      <w:r>
+        <w:t xml:space="preserve"> </w:t>
+      </w:r>
+      <w:r>
+        <w:rPr>
+          <w:bCs/>
+          <w:b/>
+        </w:rPr>
+        <w:t xml:space="preserve">Posted:</w:t>
       </w:r>
       <w:r>
         <w:t xml:space="preserve"> </w:t>
@@ -690,10 +706,13 @@
           <w:bCs/>
           <w:b/>
         </w:rPr>
-        <w:t xml:space="preserve">Function-specific κ schedules</w:t>
-      </w:r>
-      <w:r>
-        <w:t xml:space="preserve">: high-confidence functions (F5, F8) operate at κ=0.05 whilst uncertain ones (F1, F7) retain κ≥1.5</w:t>
+        <w:t xml:space="preserve">Function-specific κ schedules:</w:t>
+      </w:r>
+      <w:r>
+        <w:t xml:space="preserve"> </w:t>
+      </w:r>
+      <w:r>
+        <w:t xml:space="preserve">high-confidence functions (F5, F8) operate at κ=0.05 whilst uncertain ones (F1, F7) retain κ≥1.5</w:t>
       </w:r>
     </w:p>
     <w:p>

</xml_diff>